<commit_message>
docs: rebuild the showcase; the newsletter shot shows the Insert tab
</commit_message>
<xml_diff>
--- a/docs/showcase/book.docx
+++ b/docs/showcase/book.docx
@@ -26,20 +26,6 @@
       </w:pPr>
       <w:r>
         <w:t xml:space="preserve">Contents</w:t>
-      </w:r>
-    </w:p>
-    <w:p>
-      <w:r>
-        <w:fldChar w:fldCharType="begin" w:dirty="true"/>
-      </w:r>
-      <w:r>
-        <w:instrText xml:space="preserve"> TOC \h \o "1-1" </w:instrText>
-      </w:r>
-      <w:r>
-        <w:fldChar w:fldCharType="separate"/>
-      </w:r>
-      <w:r>
-        <w:fldChar w:fldCharType="end"/>
       </w:r>
     </w:p>
     <w:p>
@@ -63,6 +49,18 @@
           <w:docGrid w:linePitch="360"/>
         </w:sectPr>
       </w:pPr>
+      <w:r>
+        <w:fldChar w:fldCharType="begin" w:dirty="true"/>
+      </w:r>
+      <w:r>
+        <w:instrText xml:space="preserve"> TOC \h \o "1-1" </w:instrText>
+      </w:r>
+      <w:r>
+        <w:fldChar w:fldCharType="separate"/>
+      </w:r>
+      <w:r>
+        <w:fldChar w:fldCharType="end"/>
+      </w:r>
     </w:p>
     <w:p>
       <w:pPr>
@@ -491,13 +489,6 @@
         <w:pStyle w:val="Normal"/>
         <w:spacing w:after="160" w:before="160"/>
         <w:jc w:val="center"/>
-      </w:pPr>
-      <w:r>
-        <w:t xml:space="preserve">*        *        *</w:t>
-      </w:r>
-    </w:p>
-    <w:p>
-      <w:pPr>
         <w:sectPr>
           <w:headerReference w:type="default" r:id="rId7"/>
           <w:headerReference w:type="first" r:id="rId8"/>
@@ -525,6 +516,9 @@
           <w:docGrid w:linePitch="360"/>
         </w:sectPr>
       </w:pPr>
+      <w:r>
+        <w:t xml:space="preserve">*        *        *</w:t>
+      </w:r>
     </w:p>
     <w:p>
       <w:pPr>
@@ -937,13 +931,6 @@
       <w:pPr>
         <w:pStyle w:val="Normal"/>
         <w:ind w:firstLine="340"/>
-      </w:pPr>
-      <w:r>
-        <w:t xml:space="preserve">It was high time to go, for the pool was getting quite crowded with the birds and animals that had fallen into it: there were a Duck and a Dodo, a Lory and an Eaglet, and several other curious creatures. Alice led the way, and the whole party swam to the shore.</w:t>
-      </w:r>
-    </w:p>
-    <w:p>
-      <w:pPr>
         <w:sectPr>
           <w:headerReference w:type="default" r:id="rId13"/>
           <w:headerReference w:type="first" r:id="rId14"/>
@@ -971,6 +958,9 @@
           <w:docGrid w:linePitch="360"/>
         </w:sectPr>
       </w:pPr>
+      <w:r>
+        <w:t xml:space="preserve">It was high time to go, for the pool was getting quite crowded with the birds and animals that had fallen into it: there were a Duck and a Dodo, a Lory and an Eaglet, and several other curious creatures. Alice led the way, and the whole party swam to the shore.</w:t>
+      </w:r>
     </w:p>
     <w:p>
       <w:pPr>
@@ -1580,13 +1570,6 @@
       <w:pPr>
         <w:pStyle w:val="Normal"/>
         <w:ind w:firstLine="340"/>
-      </w:pPr>
-      <w:r>
-        <w:t xml:space="preserve">“I wish I hadn’t mentioned Dinah!” she said to herself in a melancholy tone. “Nobody seems to like her, down here, and I’m sure she’s the best cat in the world! Oh, my dear Dinah! I wonder if I shall ever see you any more!” And here poor Alice began to cry again, for she felt very lonely and low-spirited. In a little while, however, she again heard a little pattering of footsteps in the distance, and she looked up eagerly, half hoping that the Mouse had changed his mind, and was coming back to finish his story.</w:t>
-      </w:r>
-    </w:p>
-    <w:p>
-      <w:pPr>
         <w:sectPr>
           <w:headerReference w:type="default" r:id="rId19"/>
           <w:headerReference w:type="first" r:id="rId20"/>
@@ -1614,6 +1597,9 @@
           <w:docGrid w:linePitch="360"/>
         </w:sectPr>
       </w:pPr>
+      <w:r>
+        <w:t xml:space="preserve">“I wish I hadn’t mentioned Dinah!” she said to herself in a melancholy tone. “Nobody seems to like her, down here, and I’m sure she’s the best cat in the world! Oh, my dear Dinah! I wonder if I shall ever see you any more!” And here poor Alice began to cry again, for she felt very lonely and low-spirited. In a little while, however, she again heard a little pattering of footsteps in the distance, and she looked up eagerly, half hoping that the Mouse had changed his mind, and was coming back to finish his story.</w:t>
+      </w:r>
     </w:p>
     <w:p>
       <w:pPr>
@@ -2224,13 +2210,6 @@
       <w:pPr>
         <w:pStyle w:val="Normal"/>
         <w:ind w:firstLine="340"/>
-      </w:pPr>
-      <w:r>
-        <w:t xml:space="preserve">She stretched herself up on tiptoe, and peeped over the edge of the mushroom, and her eyes immediately met those of a large blue caterpillar, that was sitting on the top with its arms folded, quietly smoking a long hookah, and taking not the smallest notice of her or of anything else.</w:t>
-      </w:r>
-    </w:p>
-    <w:p>
-      <w:pPr>
         <w:sectPr>
           <w:headerReference w:type="default" r:id="rId25"/>
           <w:headerReference w:type="first" r:id="rId26"/>
@@ -2258,6 +2237,9 @@
           <w:docGrid w:linePitch="360"/>
         </w:sectPr>
       </w:pPr>
+      <w:r>
+        <w:t xml:space="preserve">She stretched herself up on tiptoe, and peeped over the edge of the mushroom, and her eyes immediately met those of a large blue caterpillar, that was sitting on the top with its arms folded, quietly smoking a long hookah, and taking not the smallest notice of her or of anything else.</w:t>
+      </w:r>
     </w:p>
     <w:p>
       <w:pPr>
@@ -3225,33 +3207,6 @@
       <w:pPr>
         <w:pStyle w:val="Normal"/>
         <w:ind w:firstLine="340"/>
-      </w:pPr>
-      <w:r>
-        <w:t xml:space="preserve">It was so long since she had been anything near the right size, that it felt quite strange at first; but she got used to it in a few minutes, and began talking to herself, as usual. “Come, there’s half my plan done now! How puzzling all these changes are! I’m never sure what I’m going to be, from one minute to another! However, I’ve got back to my right size: the next thing is, to get into that beautiful garden—how </w:t>
-      </w:r>
-      <w:r>
-        <w:rPr>
-          <w:i/>
-          <w:iCs/>
-        </w:rPr>
-        <w:t xml:space="preserve">is</w:t>
-      </w:r>
-      <w:r>
-        <w:t xml:space="preserve"> that to be done, I wonder?” As she said this, she came suddenly upon an open place, with a little house in it about four feet high. “Whoever lives there,” thought Alice, “it’ll never do to come upon them </w:t>
-      </w:r>
-      <w:r>
-        <w:rPr>
-          <w:i/>
-          <w:iCs/>
-        </w:rPr>
-        <w:t xml:space="preserve">this</w:t>
-      </w:r>
-      <w:r>
-        <w:t xml:space="preserve"> size: why, I should frighten them out of their wits!” So she began nibbling at the righthand bit again, and did not venture to go near the house till she had brought herself down to nine inches high.</w:t>
-      </w:r>
-    </w:p>
-    <w:p>
-      <w:pPr>
         <w:sectPr>
           <w:headerReference w:type="default" r:id="rId31"/>
           <w:headerReference w:type="first" r:id="rId32"/>
@@ -3279,6 +3234,29 @@
           <w:docGrid w:linePitch="360"/>
         </w:sectPr>
       </w:pPr>
+      <w:r>
+        <w:t xml:space="preserve">It was so long since she had been anything near the right size, that it felt quite strange at first; but she got used to it in a few minutes, and began talking to herself, as usual. “Come, there’s half my plan done now! How puzzling all these changes are! I’m never sure what I’m going to be, from one minute to another! However, I’ve got back to my right size: the next thing is, to get into that beautiful garden—how </w:t>
+      </w:r>
+      <w:r>
+        <w:rPr>
+          <w:i/>
+          <w:iCs/>
+        </w:rPr>
+        <w:t xml:space="preserve">is</w:t>
+      </w:r>
+      <w:r>
+        <w:t xml:space="preserve"> that to be done, I wonder?” As she said this, she came suddenly upon an open place, with a little house in it about four feet high. “Whoever lives there,” thought Alice, “it’ll never do to come upon them </w:t>
+      </w:r>
+      <w:r>
+        <w:rPr>
+          <w:i/>
+          <w:iCs/>
+        </w:rPr>
+        <w:t xml:space="preserve">this</w:t>
+      </w:r>
+      <w:r>
+        <w:t xml:space="preserve"> size: why, I should frighten them out of their wits!” So she began nibbling at the righthand bit again, and did not venture to go near the house till she had brought herself down to nine inches high.</w:t>
+      </w:r>
     </w:p>
     <w:p>
       <w:pPr>
@@ -4201,13 +4179,6 @@
       <w:pPr>
         <w:pStyle w:val="Normal"/>
         <w:ind w:firstLine="340"/>
-      </w:pPr>
-      <w:r>
-        <w:t xml:space="preserve">She had not gone much farther before she came in sight of the house of the March Hare: she thought it must be the right house, because the chimneys were shaped like ears and the roof was thatched with fur. It was so large a house, that she did not like to go nearer till she had nibbled some more of the lefthand bit of mushroom, and raised herself to about two feet high: even then she walked up towards it rather timidly, saying to herself “Suppose it should be raving mad after all! I almost wish I’d gone to see the Hatter instead!”</w:t>
-      </w:r>
-    </w:p>
-    <w:p>
-      <w:pPr>
         <w:sectPr>
           <w:headerReference w:type="default" r:id="rId37"/>
           <w:headerReference w:type="first" r:id="rId38"/>
@@ -4235,6 +4206,9 @@
           <w:docGrid w:linePitch="360"/>
         </w:sectPr>
       </w:pPr>
+      <w:r>
+        <w:t xml:space="preserve">She had not gone much farther before she came in sight of the house of the March Hare: she thought it must be the right house, because the chimneys were shaped like ears and the roof was thatched with fur. It was so large a house, that she did not like to go nearer till she had nibbled some more of the lefthand bit of mushroom, and raised herself to about two feet high: even then she walked up towards it rather timidly, saying to herself “Suppose it should be raving mad after all! I almost wish I’d gone to see the Hatter instead!”</w:t>
+      </w:r>
     </w:p>
     <w:p>
       <w:pPr>
@@ -5392,23 +5366,6 @@
       <w:pPr>
         <w:pStyle w:val="Normal"/>
         <w:ind w:firstLine="340"/>
-      </w:pPr>
-      <w:r>
-        <w:t xml:space="preserve">Once more she found herself in the long hall, and close to the little glass table. “Now, I’ll manage better this time,” she said to herself, and began by taking the little golden key, and unlocking the door that led into the garden. Then she went to work nibbling at the mushroom (she had kept a piece of it in her pocket) till she was about a foot high: then she walked down the little passage: and </w:t>
-      </w:r>
-      <w:r>
-        <w:rPr>
-          <w:i/>
-          <w:iCs/>
-        </w:rPr>
-        <w:t xml:space="preserve">then</w:t>
-      </w:r>
-      <w:r>
-        <w:t xml:space="preserve">—she found herself at last in the beautiful garden, among the bright flower-beds and the cool fountains.</w:t>
-      </w:r>
-    </w:p>
-    <w:p>
-      <w:pPr>
         <w:sectPr>
           <w:headerReference w:type="default" r:id="rId43"/>
           <w:headerReference w:type="first" r:id="rId44"/>
@@ -5436,6 +5393,19 @@
           <w:docGrid w:linePitch="360"/>
         </w:sectPr>
       </w:pPr>
+      <w:r>
+        <w:t xml:space="preserve">Once more she found herself in the long hall, and close to the little glass table. “Now, I’ll manage better this time,” she said to herself, and began by taking the little golden key, and unlocking the door that led into the garden. Then she went to work nibbling at the mushroom (she had kept a piece of it in her pocket) till she was about a foot high: then she walked down the little passage: and </w:t>
+      </w:r>
+      <w:r>
+        <w:rPr>
+          <w:i/>
+          <w:iCs/>
+        </w:rPr>
+        <w:t xml:space="preserve">then</w:t>
+      </w:r>
+      <w:r>
+        <w:t xml:space="preserve">—she found herself at last in the beautiful garden, among the bright flower-beds and the cool fountains.</w:t>
+      </w:r>
     </w:p>
     <w:p>
       <w:pPr>
@@ -6217,13 +6187,6 @@
       <w:pPr>
         <w:pStyle w:val="Normal"/>
         <w:ind w:firstLine="340"/>
-      </w:pPr>
-      <w:r>
-        <w:t xml:space="preserve">The Cat’s head began fading away the moment he was gone, and, by the time he had come back with the Duchess, it had entirely disappeared; so the King and the executioner ran wildly up and down looking for it, while the rest of the party went back to the game.</w:t>
-      </w:r>
-    </w:p>
-    <w:p>
-      <w:pPr>
         <w:sectPr>
           <w:headerReference w:type="default" r:id="rId49"/>
           <w:headerReference w:type="first" r:id="rId50"/>
@@ -6251,6 +6214,9 @@
           <w:docGrid w:linePitch="360"/>
         </w:sectPr>
       </w:pPr>
+      <w:r>
+        <w:t xml:space="preserve">The Cat’s head began fading away the moment he was gone, and, by the time he had come back with the Duchess, it had entirely disappeared; so the King and the executioner ran wildly up and down looking for it, while the rest of the party went back to the game.</w:t>
+      </w:r>
     </w:p>
     <w:p>
       <w:pPr>
@@ -7271,13 +7237,6 @@
       <w:pPr>
         <w:pStyle w:val="Normal"/>
         <w:ind w:firstLine="340"/>
-      </w:pPr>
-      <w:r>
-        <w:t xml:space="preserve">“That’s enough about lessons,” the Gryphon interrupted in a very decided tone: “tell her something about the games now.”</w:t>
-      </w:r>
-    </w:p>
-    <w:p>
-      <w:pPr>
         <w:sectPr>
           <w:headerReference w:type="default" r:id="rId55"/>
           <w:headerReference w:type="first" r:id="rId56"/>
@@ -7305,6 +7264,9 @@
           <w:docGrid w:linePitch="360"/>
         </w:sectPr>
       </w:pPr>
+      <w:r>
+        <w:t xml:space="preserve">“That’s enough about lessons,” the Gryphon interrupted in a very decided tone: “tell her something about the games now.”</w:t>
+      </w:r>
     </w:p>
     <w:p>
       <w:pPr>
@@ -8236,13 +8198,6 @@
       <w:pPr>
         <w:pStyle w:val="Normal"/>
         <w:ind w:firstLine="340"/>
-      </w:pPr>
-      <w:r>
-        <w:t xml:space="preserve">“Soo—oop of the e—e—evening, Beautiful, beautiful Soup!”</w:t>
-      </w:r>
-    </w:p>
-    <w:p>
-      <w:pPr>
         <w:sectPr>
           <w:headerReference w:type="default" r:id="rId61"/>
           <w:headerReference w:type="first" r:id="rId62"/>
@@ -8270,6 +8225,9 @@
           <w:docGrid w:linePitch="360"/>
         </w:sectPr>
       </w:pPr>
+      <w:r>
+        <w:t xml:space="preserve">“Soo—oop of the e—e—evening, Beautiful, beautiful Soup!”</w:t>
+      </w:r>
     </w:p>
     <w:p>
       <w:pPr>
@@ -9078,23 +9036,6 @@
       <w:pPr>
         <w:pStyle w:val="Normal"/>
         <w:ind w:firstLine="340"/>
-      </w:pPr>
-      <w:r>
-        <w:t xml:space="preserve">Alice watched the White Rabbit as he fumbled over the list, feeling very curious to see what the next witness would be like, “—for they haven’t got much evidence </w:t>
-      </w:r>
-      <w:r>
-        <w:rPr>
-          <w:i/>
-          <w:iCs/>
-        </w:rPr>
-        <w:t xml:space="preserve">yet</w:t>
-      </w:r>
-      <w:r>
-        <w:t xml:space="preserve">,” she said to herself. Imagine her surprise, when the White Rabbit read out, at the top of his shrill little voice, the name “Alice!”</w:t>
-      </w:r>
-    </w:p>
-    <w:p>
-      <w:pPr>
         <w:sectPr>
           <w:headerReference w:type="default" r:id="rId67"/>
           <w:headerReference w:type="first" r:id="rId68"/>
@@ -9122,6 +9063,19 @@
           <w:docGrid w:linePitch="360"/>
         </w:sectPr>
       </w:pPr>
+      <w:r>
+        <w:t xml:space="preserve">Alice watched the White Rabbit as he fumbled over the list, feeling very curious to see what the next witness would be like, “—for they haven’t got much evidence </w:t>
+      </w:r>
+      <w:r>
+        <w:rPr>
+          <w:i/>
+          <w:iCs/>
+        </w:rPr>
+        <w:t xml:space="preserve">yet</w:t>
+      </w:r>
+      <w:r>
+        <w:t xml:space="preserve">,” she said to herself. Imagine her surprise, when the White Rabbit read out, at the top of his shrill little voice, the name “Alice!”</w:t>
+      </w:r>
     </w:p>
     <w:p>
       <w:pPr>
@@ -11363,7 +11317,7 @@
       <w:jc w:val="center"/>
     </w:pPr>
     <w:rPr>
-      <w:rFonts w:ascii="Times New Roman" w:cs="Times New Roman" w:eastAsia="Times New Roman" w:hAnsi="Times New Roman"/>
+      <w:rFonts w:ascii="Times New Roman" w:cs="Times New Roman" w:hAnsi="Times New Roman"/>
       <w:b w:val="false"/>
       <w:bCs w:val="false"/>
       <w:kern w:val="1"/>
@@ -11382,7 +11336,7 @@
       <w:jc w:val="center"/>
     </w:pPr>
     <w:rPr>
-      <w:rFonts w:ascii="Times New Roman" w:cs="Times New Roman" w:eastAsia="Times New Roman" w:hAnsi="Times New Roman"/>
+      <w:rFonts w:ascii="Times New Roman" w:cs="Times New Roman" w:hAnsi="Times New Roman"/>
       <w:b w:val="false"/>
       <w:bCs w:val="false"/>
       <w:i/>
@@ -11575,7 +11529,7 @@
       <w:jc w:val="both"/>
     </w:pPr>
     <w:rPr>
-      <w:rFonts w:ascii="Times New Roman" w:cs="Times New Roman" w:eastAsia="Times New Roman" w:hAnsi="Times New Roman"/>
+      <w:rFonts w:ascii="Times New Roman" w:cs="Times New Roman" w:hAnsi="Times New Roman"/>
       <w:kern w:val="1"/>
       <w:sz w:val="22"/>
       <w:szCs w:val="22"/>
@@ -11590,7 +11544,7 @@
       <w:spacing w:after="120" w:before="240"/>
     </w:pPr>
     <w:rPr>
-      <w:rFonts w:ascii="Arial" w:cs="Arial" w:eastAsia="Arial" w:hAnsi="Arial"/>
+      <w:rFonts w:ascii="Arial" w:cs="Arial" w:hAnsi="Arial"/>
       <w:b/>
       <w:bCs/>
       <w:kern w:val="1"/>
@@ -11665,7 +11619,7 @@
       <w:jc w:val="center"/>
     </w:pPr>
     <w:rPr>
-      <w:rFonts w:ascii="Times New Roman" w:cs="Times New Roman" w:eastAsia="Times New Roman" w:hAnsi="Times New Roman"/>
+      <w:rFonts w:ascii="Times New Roman" w:cs="Times New Roman" w:hAnsi="Times New Roman"/>
       <w:b w:val="false"/>
       <w:bCs w:val="false"/>
       <w:i/>
@@ -11773,7 +11727,7 @@
     <w:unhideWhenUsed/>
     <w:qFormat/>
     <w:rPr>
-      <w:rFonts w:ascii="Courier New" w:cs="Courier New" w:eastAsia="Courier New" w:hAnsi="Courier New"/>
+      <w:rFonts w:ascii="Courier New" w:cs="Courier New" w:hAnsi="Courier New"/>
       <w:kern w:val="1"/>
     </w:rPr>
   </w:style>

</xml_diff>